<commit_message>
Atualiza modelos de requerimento de certidão negativa e positiva
Co-Authored-By: Claude Sonnet 5 <noreply@anthropic.com>
Claude-Session: https://claude.ai/code/session_01DNiNYbtZFE5vXZFY7b7xeC
</commit_message>
<xml_diff>
--- a/assets/docs/requerimento-certidao-negativa.docx
+++ b/assets/docs/requerimento-certidao-negativa.docx
@@ -70,9 +70,127 @@
           <w:sz w:val="24"/>
           <w:szCs w:val="24"/>
         </w:rPr>
-        <w:t>NEGATIVA</w:t>
-      </w:r>
-      <w:r>
+        <w:t>NEGATIVA DE PROTESTO</w:t>
+      </w:r>
+    </w:p>
+    <w:p>
+      <w:pPr>
+        <w:pStyle w:val="Normal"/>
+        <w:bidi w:val="0"/>
+        <w:spacing w:lineRule="auto" w:line="240" w:before="0" w:after="113"/>
+        <w:ind w:hanging="0" w:left="2124"/>
+        <w:rPr>
+          <w:rFonts w:ascii="Times New Roman" w:hAnsi="Times New Roman"/>
+          <w:sz w:val="24"/>
+          <w:szCs w:val="24"/>
+        </w:rPr>
+      </w:pPr>
+      <w:r>
+        <w:rPr>
+          <w:rFonts w:ascii="Times New Roman" w:hAnsi="Times New Roman"/>
+          <w:sz w:val="24"/>
+          <w:szCs w:val="24"/>
+        </w:rPr>
+      </w:r>
+    </w:p>
+    <w:p>
+      <w:pPr>
+        <w:pStyle w:val="Normal"/>
+        <w:widowControl/>
+        <w:suppressAutoHyphens w:val="true"/>
+        <w:bidi w:val="0"/>
+        <w:spacing w:lineRule="auto" w:line="240" w:before="0" w:after="113"/>
+        <w:ind w:firstLine="1417" w:left="0" w:right="0"/>
+        <w:jc w:val="left"/>
+        <w:rPr>
+          <w:rFonts w:ascii="Times New Roman" w:hAnsi="Times New Roman"/>
+          <w:sz w:val="24"/>
+          <w:szCs w:val="24"/>
+        </w:rPr>
+      </w:pPr>
+      <w:r>
+        <w:rPr>
+          <w:rFonts w:ascii="Cambria" w:hAnsi="Cambria"/>
+          <w:sz w:val="24"/>
+          <w:szCs w:val="24"/>
+        </w:rPr>
+        <w:t>Ao Tabelião de Protestos de Ijuí/RS</w:t>
+      </w:r>
+    </w:p>
+    <w:p>
+      <w:pPr>
+        <w:pStyle w:val="Normal"/>
+        <w:bidi w:val="0"/>
+        <w:spacing w:lineRule="auto" w:line="240" w:before="0" w:after="113"/>
+        <w:ind w:hanging="0" w:left="0"/>
+        <w:rPr>
+          <w:rFonts w:ascii="Times New Roman" w:hAnsi="Times New Roman"/>
+          <w:sz w:val="24"/>
+          <w:szCs w:val="24"/>
+        </w:rPr>
+      </w:pPr>
+      <w:r>
+        <w:rPr>
+          <w:rFonts w:ascii="Times New Roman" w:hAnsi="Times New Roman"/>
+          <w:sz w:val="24"/>
+          <w:szCs w:val="24"/>
+        </w:rPr>
+      </w:r>
+    </w:p>
+    <w:p>
+      <w:pPr>
+        <w:pStyle w:val="Normal"/>
+        <w:widowControl/>
+        <w:suppressAutoHyphens w:val="true"/>
+        <w:bidi w:val="0"/>
+        <w:spacing w:lineRule="auto" w:line="240" w:before="0" w:after="113"/>
+        <w:ind w:firstLine="1417" w:left="0" w:right="0"/>
+        <w:jc w:val="both"/>
+        <w:rPr>
+          <w:rFonts w:ascii="Times New Roman" w:hAnsi="Times New Roman"/>
+          <w:sz w:val="24"/>
+          <w:szCs w:val="24"/>
+        </w:rPr>
+      </w:pPr>
+      <w:r>
+        <w:rPr>
+          <w:rFonts w:ascii="Cambria" w:hAnsi="Cambria"/>
+          <w:sz w:val="24"/>
+          <w:szCs w:val="24"/>
+        </w:rPr>
+        <w:t>_______________________________________________________________________________, CPF/CNPJ: ________________________________, domiciliado na _________________________________________________________, Telefone: ________________________________, e-mail:_________________________________________. vem requerer a expedição de certidão em seu próprio nome</w:t>
+      </w:r>
+    </w:p>
+    <w:p>
+      <w:pPr>
+        <w:pStyle w:val="Normal"/>
+        <w:widowControl/>
+        <w:suppressAutoHyphens w:val="true"/>
+        <w:bidi w:val="0"/>
+        <w:spacing w:lineRule="auto" w:line="240" w:before="0" w:after="113"/>
+        <w:ind w:firstLine="1417" w:left="0" w:right="0"/>
+        <w:jc w:val="both"/>
+        <w:rPr>
+          <w:rFonts w:ascii="Times New Roman" w:hAnsi="Times New Roman"/>
+          <w:sz w:val="24"/>
+          <w:szCs w:val="24"/>
+        </w:rPr>
+      </w:pPr>
+      <w:r>
+        <w:rPr>
+          <w:rFonts w:ascii="Times New Roman" w:hAnsi="Times New Roman"/>
+          <w:sz w:val="24"/>
+          <w:szCs w:val="24"/>
+        </w:rPr>
+      </w:r>
+    </w:p>
+    <w:p>
+      <w:pPr>
+        <w:pStyle w:val="Normal"/>
+        <w:bidi w:val="0"/>
+        <w:spacing w:lineRule="auto" w:line="240" w:before="0" w:after="113"/>
+        <w:ind w:hanging="0" w:left="0"/>
+        <w:jc w:val="center"/>
         <w:rPr>
           <w:rFonts w:ascii="Cambria" w:hAnsi="Cambria"/>
           <w:b/>
@@ -80,210 +198,15 @@
           <w:sz w:val="24"/>
           <w:szCs w:val="24"/>
         </w:rPr>
-        <w:t xml:space="preserve"> DE PROTESTO</w:t>
-      </w:r>
-    </w:p>
-    <w:p>
-      <w:pPr>
-        <w:pStyle w:val="Normal"/>
-        <w:bidi w:val="0"/>
-        <w:spacing w:lineRule="auto" w:line="240" w:before="0" w:after="113"/>
-        <w:ind w:hanging="0" w:left="2124"/>
-        <w:rPr>
-          <w:rFonts w:ascii="Times New Roman" w:hAnsi="Times New Roman"/>
-          <w:sz w:val="24"/>
-          <w:szCs w:val="24"/>
-        </w:rPr>
-      </w:pPr>
-      <w:r>
-        <w:rPr>
-          <w:rFonts w:ascii="Times New Roman" w:hAnsi="Times New Roman"/>
-          <w:sz w:val="24"/>
-          <w:szCs w:val="24"/>
-        </w:rPr>
-      </w:r>
-    </w:p>
-    <w:p>
-      <w:pPr>
-        <w:pStyle w:val="Normal"/>
-        <w:widowControl/>
-        <w:suppressAutoHyphens w:val="true"/>
-        <w:bidi w:val="0"/>
-        <w:spacing w:lineRule="auto" w:line="240" w:before="0" w:after="113"/>
-        <w:ind w:firstLine="1417" w:left="0" w:right="0"/>
-        <w:jc w:val="left"/>
-        <w:rPr>
-          <w:rFonts w:ascii="Times New Roman" w:hAnsi="Times New Roman"/>
-          <w:sz w:val="24"/>
-          <w:szCs w:val="24"/>
-        </w:rPr>
-      </w:pPr>
-      <w:r>
-        <w:rPr>
-          <w:rFonts w:ascii="Cambria" w:hAnsi="Cambria"/>
-          <w:sz w:val="24"/>
-          <w:szCs w:val="24"/>
-        </w:rPr>
-        <w:t>Ao Tabelião de Protestos de Ijuí/RS</w:t>
-      </w:r>
-    </w:p>
-    <w:p>
-      <w:pPr>
-        <w:pStyle w:val="Normal"/>
-        <w:bidi w:val="0"/>
-        <w:spacing w:lineRule="auto" w:line="240" w:before="0" w:after="113"/>
-        <w:ind w:hanging="0" w:left="0"/>
-        <w:rPr>
-          <w:rFonts w:ascii="Times New Roman" w:hAnsi="Times New Roman"/>
-          <w:sz w:val="24"/>
-          <w:szCs w:val="24"/>
-        </w:rPr>
-      </w:pPr>
-      <w:r>
-        <w:rPr>
-          <w:rFonts w:ascii="Times New Roman" w:hAnsi="Times New Roman"/>
-          <w:sz w:val="24"/>
-          <w:szCs w:val="24"/>
-        </w:rPr>
-      </w:r>
-    </w:p>
-    <w:p>
-      <w:pPr>
-        <w:pStyle w:val="Normal"/>
-        <w:widowControl/>
-        <w:suppressAutoHyphens w:val="true"/>
-        <w:bidi w:val="0"/>
-        <w:spacing w:lineRule="auto" w:line="240" w:before="0" w:after="113"/>
-        <w:ind w:firstLine="1417" w:left="0" w:right="0"/>
-        <w:jc w:val="both"/>
-        <w:rPr>
-          <w:rFonts w:ascii="Times New Roman" w:hAnsi="Times New Roman"/>
-          <w:sz w:val="24"/>
-          <w:szCs w:val="24"/>
-        </w:rPr>
-      </w:pPr>
-      <w:r>
-        <w:rPr>
-          <w:rFonts w:ascii="Cambria" w:hAnsi="Cambria"/>
-          <w:sz w:val="24"/>
-          <w:szCs w:val="24"/>
-        </w:rPr>
-        <w:t>________________________________________________</w:t>
-      </w:r>
-      <w:r>
-        <w:rPr>
-          <w:rFonts w:ascii="Cambria" w:hAnsi="Cambria"/>
-          <w:sz w:val="24"/>
-          <w:szCs w:val="24"/>
-        </w:rPr>
-        <w:t>__________________________</w:t>
-      </w:r>
-      <w:r>
-        <w:rPr>
-          <w:rFonts w:ascii="Cambria" w:hAnsi="Cambria"/>
-          <w:sz w:val="24"/>
-          <w:szCs w:val="24"/>
-        </w:rPr>
-        <w:t>_____, CPF/CNPJ: _________________</w:t>
-      </w:r>
-      <w:r>
-        <w:rPr>
-          <w:rFonts w:ascii="Cambria" w:hAnsi="Cambria"/>
-          <w:sz w:val="24"/>
-          <w:szCs w:val="24"/>
-        </w:rPr>
-        <w:t>_________</w:t>
-      </w:r>
-      <w:r>
-        <w:rPr>
-          <w:rFonts w:ascii="Cambria" w:hAnsi="Cambria"/>
-          <w:sz w:val="24"/>
-          <w:szCs w:val="24"/>
-        </w:rPr>
-        <w:t>______, domiciliado na ________</w:t>
-      </w:r>
-      <w:r>
-        <w:rPr>
-          <w:rFonts w:ascii="Cambria" w:hAnsi="Cambria"/>
-          <w:sz w:val="24"/>
-          <w:szCs w:val="24"/>
-        </w:rPr>
-        <w:t>___________________</w:t>
-      </w:r>
-      <w:r>
-        <w:rPr>
-          <w:rFonts w:ascii="Cambria" w:hAnsi="Cambria"/>
-          <w:sz w:val="24"/>
-          <w:szCs w:val="24"/>
-        </w:rPr>
-        <w:t>_____________________________</w:t>
-      </w:r>
-      <w:r>
-        <w:rPr>
-          <w:rFonts w:ascii="Cambria" w:hAnsi="Cambria"/>
-          <w:sz w:val="24"/>
-          <w:szCs w:val="24"/>
-        </w:rPr>
-        <w:t>_</w:t>
-      </w:r>
-      <w:r>
-        <w:rPr>
-          <w:rFonts w:ascii="Cambria" w:hAnsi="Cambria"/>
-          <w:sz w:val="24"/>
-          <w:szCs w:val="24"/>
-        </w:rPr>
-        <w:t>, Telefone: ________________</w:t>
-      </w:r>
-      <w:r>
-        <w:rPr>
-          <w:rFonts w:ascii="Cambria" w:hAnsi="Cambria"/>
-          <w:sz w:val="24"/>
-          <w:szCs w:val="24"/>
-        </w:rPr>
-        <w:t>________________</w:t>
-      </w:r>
-      <w:r>
-        <w:rPr>
-          <w:rFonts w:ascii="Cambria" w:hAnsi="Cambria"/>
-          <w:sz w:val="24"/>
-          <w:szCs w:val="24"/>
-        </w:rPr>
-        <w:t>, e-mail:_________________________</w:t>
-      </w:r>
-      <w:r>
-        <w:rPr>
-          <w:rFonts w:ascii="Cambria" w:hAnsi="Cambria"/>
-          <w:sz w:val="24"/>
-          <w:szCs w:val="24"/>
-        </w:rPr>
-        <w:t>________________</w:t>
-      </w:r>
-      <w:r>
-        <w:rPr>
-          <w:rFonts w:ascii="Cambria" w:hAnsi="Cambria"/>
-          <w:sz w:val="24"/>
-          <w:szCs w:val="24"/>
-        </w:rPr>
-        <w:t>. vem requerer a expedição de certidão em seu próprio nome</w:t>
-      </w:r>
-    </w:p>
-    <w:p>
-      <w:pPr>
-        <w:pStyle w:val="Normal"/>
-        <w:widowControl/>
-        <w:suppressAutoHyphens w:val="true"/>
-        <w:bidi w:val="0"/>
-        <w:spacing w:lineRule="auto" w:line="240" w:before="0" w:after="113"/>
-        <w:ind w:firstLine="1417" w:left="0" w:right="0"/>
-        <w:jc w:val="both"/>
-        <w:rPr>
-          <w:rFonts w:ascii="Times New Roman" w:hAnsi="Times New Roman"/>
-          <w:sz w:val="24"/>
-          <w:szCs w:val="24"/>
-        </w:rPr>
-      </w:pPr>
-      <w:r>
-        <w:rPr/>
+      </w:pPr>
+      <w:r>
+        <w:rPr>
+          <w:rFonts w:ascii="Cambria" w:hAnsi="Cambria"/>
+          <w:b/>
+          <w:bCs/>
+          <w:sz w:val="24"/>
+          <w:szCs w:val="24"/>
+        </w:rPr>
       </w:r>
     </w:p>
     <w:p>
@@ -309,6 +232,7 @@
           <w:sz w:val="24"/>
           <w:szCs w:val="24"/>
         </w:rPr>
+        <w:t>ESCOLHA DA MODALIDADE DE EMISSÃO</w:t>
       </w:r>
     </w:p>
     <w:p>
@@ -329,30 +253,32 @@
       <w:r>
         <w:rPr>
           <w:rFonts w:ascii="Cambria" w:hAnsi="Cambria"/>
+          <w:b w:val="false"/>
+          <w:bCs w:val="false"/>
+        </w:rPr>
+        <w:t>(art. 1.014, § 6º CNNR)</w:t>
+      </w:r>
+    </w:p>
+    <w:p>
+      <w:pPr>
+        <w:pStyle w:val="Normal"/>
+        <w:bidi w:val="0"/>
+        <w:spacing w:lineRule="auto" w:line="240" w:before="0" w:after="113"/>
+        <w:ind w:hanging="0" w:left="0"/>
+        <w:jc w:val="center"/>
+        <w:rPr>
+          <w:rFonts w:ascii="Cambria" w:hAnsi="Cambria"/>
           <w:b/>
           <w:bCs/>
           <w:sz w:val="24"/>
           <w:szCs w:val="24"/>
         </w:rPr>
-        <w:t>ESCOLHA DA MODALIDADE DE EMISSÃO</w:t>
-      </w:r>
-    </w:p>
-    <w:p>
-      <w:pPr>
-        <w:pStyle w:val="Normal"/>
-        <w:bidi w:val="0"/>
-        <w:spacing w:lineRule="auto" w:line="240" w:before="0" w:after="113"/>
-        <w:ind w:hanging="0" w:left="0"/>
-        <w:jc w:val="both"/>
-        <w:rPr>
-          <w:rFonts w:ascii="Times New Roman" w:hAnsi="Times New Roman"/>
-          <w:sz w:val="24"/>
-          <w:szCs w:val="24"/>
-        </w:rPr>
-      </w:pPr>
-      <w:r>
-        <w:rPr>
-          <w:rFonts w:ascii="Times New Roman" w:hAnsi="Times New Roman"/>
+      </w:pPr>
+      <w:r>
+        <w:rPr>
+          <w:rFonts w:ascii="Cambria" w:hAnsi="Cambria"/>
+          <w:b/>
+          <w:bCs/>
           <w:sz w:val="24"/>
           <w:szCs w:val="24"/>
         </w:rPr>
@@ -610,8 +536,12 @@
       </w:r>
     </w:p>
     <w:sectPr>
-      <w:headerReference w:type="default" r:id="rId2"/>
-      <w:footerReference w:type="default" r:id="rId3"/>
+      <w:headerReference w:type="even" r:id="rId2"/>
+      <w:headerReference w:type="default" r:id="rId3"/>
+      <w:headerReference w:type="first" r:id="rId4"/>
+      <w:footerReference w:type="even" r:id="rId5"/>
+      <w:footerReference w:type="default" r:id="rId6"/>
+      <w:footerReference w:type="first" r:id="rId7"/>
       <w:type w:val="nextPage"/>
       <w:pgSz w:w="11906" w:h="16838"/>
       <w:pgMar w:left="1134" w:right="1134" w:gutter="0" w:header="1134" w:top="2861" w:footer="1134" w:bottom="1923"/>
@@ -628,6 +558,70 @@
 <w:ftr xmlns:o="urn:schemas-microsoft-com:office:office" xmlns:r="http://schemas.openxmlformats.org/officeDocument/2006/relationships" xmlns:v="urn:schemas-microsoft-com:vml" xmlns:w="http://schemas.openxmlformats.org/wordprocessingml/2006/main" xmlns:w10="urn:schemas-microsoft-com:office:word" xmlns:wp="http://schemas.openxmlformats.org/drawingml/2006/wordprocessingDrawing" xmlns:pic="http://schemas.openxmlformats.org/drawingml/2006/picture" xmlns:wps="http://schemas.microsoft.com/office/word/2010/wordprocessingShape" xmlns:wpg="http://schemas.microsoft.com/office/word/2010/wordprocessingGroup" xmlns:mc="http://schemas.openxmlformats.org/markup-compatibility/2006" xmlns:wp14="http://schemas.microsoft.com/office/word/2010/wordprocessingDrawing" xmlns:w14="http://schemas.microsoft.com/office/word/2010/wordml" xmlns:w15="http://schemas.microsoft.com/office/word/2012/wordml" mc:Ignorable="w14 wp14 w15">
   <w:p>
     <w:pPr>
+      <w:pStyle w:val="Footer"/>
+      <w:rPr/>
+    </w:pPr>
+    <w:r>
+      <w:rPr/>
+    </w:r>
+  </w:p>
+</w:ftr>
+</file>
+
+<file path=word/footer2.xml><?xml version="1.0" encoding="utf-8"?>
+<w:ftr xmlns:o="urn:schemas-microsoft-com:office:office" xmlns:r="http://schemas.openxmlformats.org/officeDocument/2006/relationships" xmlns:v="urn:schemas-microsoft-com:vml" xmlns:w="http://schemas.openxmlformats.org/wordprocessingml/2006/main" xmlns:w10="urn:schemas-microsoft-com:office:word" xmlns:wp="http://schemas.openxmlformats.org/drawingml/2006/wordprocessingDrawing" xmlns:pic="http://schemas.openxmlformats.org/drawingml/2006/picture" xmlns:wps="http://schemas.microsoft.com/office/word/2010/wordprocessingShape" xmlns:wpg="http://schemas.microsoft.com/office/word/2010/wordprocessingGroup" xmlns:mc="http://schemas.openxmlformats.org/markup-compatibility/2006" xmlns:wp14="http://schemas.microsoft.com/office/word/2010/wordprocessingDrawing" xmlns:w14="http://schemas.microsoft.com/office/word/2010/wordml" xmlns:w15="http://schemas.microsoft.com/office/word/2012/wordml" mc:Ignorable="w14 wp14 w15">
+  <w:p>
+    <w:pPr>
+      <w:pStyle w:val="BodyText"/>
+      <w:bidi w:val="0"/>
+      <w:spacing w:lineRule="auto" w:line="240" w:before="0" w:after="0"/>
+      <w:jc w:val="center"/>
+      <w:rPr>
+        <w:rFonts w:ascii="Times New Roman" w:hAnsi="Times New Roman"/>
+        <w:sz w:val="22"/>
+        <w:szCs w:val="22"/>
+      </w:rPr>
+    </w:pPr>
+    <w:r>
+      <w:rPr>
+        <w:rFonts w:ascii="Times New Roman" w:hAnsi="Times New Roman"/>
+        <w:sz w:val="22"/>
+        <w:szCs w:val="22"/>
+      </w:rPr>
+      <w:t>Rua 19 de Outubro, n° 127, Centro, Ijuí-RS, CEP: 98.700-145</w:t>
+    </w:r>
+  </w:p>
+  <w:p>
+    <w:pPr>
+      <w:pStyle w:val="BodyText"/>
+      <w:bidi w:val="0"/>
+      <w:spacing w:lineRule="auto" w:line="240" w:before="0" w:after="0"/>
+      <w:jc w:val="center"/>
+      <w:rPr>
+        <w:rFonts w:ascii="Times New Roman" w:hAnsi="Times New Roman"/>
+        <w:sz w:val="22"/>
+        <w:szCs w:val="22"/>
+      </w:rPr>
+    </w:pPr>
+    <w:r>
+      <w:rPr>
+        <w:rFonts w:ascii="Times New Roman" w:hAnsi="Times New Roman"/>
+        <w:sz w:val="22"/>
+        <w:szCs w:val="22"/>
+      </w:rPr>
+      <w:t xml:space="preserve">Telefone: (55) 3332-7720 </w:t>
+      <w:tab/>
+      <w:tab/>
+      <w:t>E-mail: protestoijui@gmail.com</w:t>
+    </w:r>
+  </w:p>
+</w:ftr>
+</file>
+
+<file path=word/footer3.xml><?xml version="1.0" encoding="utf-8"?>
+<w:ftr xmlns:o="urn:schemas-microsoft-com:office:office" xmlns:r="http://schemas.openxmlformats.org/officeDocument/2006/relationships" xmlns:v="urn:schemas-microsoft-com:vml" xmlns:w="http://schemas.openxmlformats.org/wordprocessingml/2006/main" xmlns:w10="urn:schemas-microsoft-com:office:word" xmlns:wp="http://schemas.openxmlformats.org/drawingml/2006/wordprocessingDrawing" xmlns:pic="http://schemas.openxmlformats.org/drawingml/2006/picture" xmlns:wps="http://schemas.microsoft.com/office/word/2010/wordprocessingShape" xmlns:wpg="http://schemas.microsoft.com/office/word/2010/wordprocessingGroup" xmlns:mc="http://schemas.openxmlformats.org/markup-compatibility/2006" xmlns:wp14="http://schemas.microsoft.com/office/word/2010/wordprocessingDrawing" xmlns:w14="http://schemas.microsoft.com/office/word/2010/wordml" xmlns:w15="http://schemas.microsoft.com/office/word/2012/wordml" mc:Ignorable="w14 wp14 w15">
+  <w:p>
+    <w:pPr>
       <w:pStyle w:val="BodyText"/>
       <w:bidi w:val="0"/>
       <w:spacing w:lineRule="auto" w:line="240" w:before="0" w:after="0"/>
@@ -675,6 +669,20 @@
 </file>
 
 <file path=word/header1.xml><?xml version="1.0" encoding="utf-8"?>
+<w:hdr xmlns:o="urn:schemas-microsoft-com:office:office" xmlns:r="http://schemas.openxmlformats.org/officeDocument/2006/relationships" xmlns:v="urn:schemas-microsoft-com:vml" xmlns:w="http://schemas.openxmlformats.org/wordprocessingml/2006/main" xmlns:w10="urn:schemas-microsoft-com:office:word" xmlns:wp="http://schemas.openxmlformats.org/drawingml/2006/wordprocessingDrawing" xmlns:pic="http://schemas.openxmlformats.org/drawingml/2006/picture" xmlns:wps="http://schemas.microsoft.com/office/word/2010/wordprocessingShape" xmlns:wpg="http://schemas.microsoft.com/office/word/2010/wordprocessingGroup" xmlns:mc="http://schemas.openxmlformats.org/markup-compatibility/2006" xmlns:wp14="http://schemas.microsoft.com/office/word/2010/wordprocessingDrawing" xmlns:w14="http://schemas.microsoft.com/office/word/2010/wordml" xmlns:w15="http://schemas.microsoft.com/office/word/2012/wordml" mc:Ignorable="w14 wp14 w15">
+  <w:p>
+    <w:pPr>
+      <w:pStyle w:val="Header"/>
+      <w:rPr/>
+    </w:pPr>
+    <w:r>
+      <w:rPr/>
+    </w:r>
+  </w:p>
+</w:hdr>
+</file>
+
+<file path=word/header2.xml><?xml version="1.0" encoding="utf-8"?>
 <w:hdr xmlns:o="urn:schemas-microsoft-com:office:office" xmlns:r="http://schemas.openxmlformats.org/officeDocument/2006/relationships" xmlns:v="urn:schemas-microsoft-com:vml" xmlns:w="http://schemas.openxmlformats.org/wordprocessingml/2006/main" xmlns:w10="urn:schemas-microsoft-com:office:word" xmlns:wp="http://schemas.openxmlformats.org/drawingml/2006/wordprocessingDrawing" xmlns:pic="http://schemas.openxmlformats.org/drawingml/2006/picture" xmlns:wps="http://schemas.microsoft.com/office/word/2010/wordprocessingShape" xmlns:wpg="http://schemas.microsoft.com/office/word/2010/wordprocessingGroup" xmlns:mc="http://schemas.openxmlformats.org/markup-compatibility/2006" xmlns:wp14="http://schemas.microsoft.com/office/word/2010/wordprocessingDrawing" xmlns:w14="http://schemas.microsoft.com/office/word/2010/wordml" xmlns:w15="http://schemas.microsoft.com/office/word/2012/wordml" mc:Ignorable="w14 wp14 w15">
   <w:p>
     <w:pPr>
@@ -749,6 +757,81 @@
 </w:hdr>
 </file>
 
+<file path=word/header3.xml><?xml version="1.0" encoding="utf-8"?>
+<w:hdr xmlns:o="urn:schemas-microsoft-com:office:office" xmlns:r="http://schemas.openxmlformats.org/officeDocument/2006/relationships" xmlns:v="urn:schemas-microsoft-com:vml" xmlns:w="http://schemas.openxmlformats.org/wordprocessingml/2006/main" xmlns:w10="urn:schemas-microsoft-com:office:word" xmlns:wp="http://schemas.openxmlformats.org/drawingml/2006/wordprocessingDrawing" xmlns:pic="http://schemas.openxmlformats.org/drawingml/2006/picture" xmlns:wps="http://schemas.microsoft.com/office/word/2010/wordprocessingShape" xmlns:wpg="http://schemas.microsoft.com/office/word/2010/wordprocessingGroup" xmlns:mc="http://schemas.openxmlformats.org/markup-compatibility/2006" xmlns:wp14="http://schemas.microsoft.com/office/word/2010/wordprocessingDrawing" xmlns:w14="http://schemas.microsoft.com/office/word/2010/wordml" xmlns:w15="http://schemas.microsoft.com/office/word/2012/wordml" mc:Ignorable="w14 wp14 w15">
+  <w:p>
+    <w:pPr>
+      <w:pStyle w:val="BodyText"/>
+      <w:bidi w:val="0"/>
+      <w:jc w:val="center"/>
+      <w:rPr/>
+    </w:pPr>
+    <w:r>
+      <w:rPr/>
+      <w:drawing>
+        <wp:inline distT="0" distB="0" distL="0" distR="0">
+          <wp:extent cx="539750" cy="641350"/>
+          <wp:effectExtent l="0" t="0" r="0" b="0"/>
+          <wp:docPr id="2" name="Figura2 Copia 1"/>
+          <wp:cNvGraphicFramePr>
+            <a:graphicFrameLocks xmlns:a="http://schemas.openxmlformats.org/drawingml/2006/main" noChangeAspect="1"/>
+          </wp:cNvGraphicFramePr>
+          <a:graphic xmlns:a="http://schemas.openxmlformats.org/drawingml/2006/main">
+            <a:graphicData uri="http://schemas.openxmlformats.org/drawingml/2006/picture">
+              <pic:pic xmlns:pic="http://schemas.openxmlformats.org/drawingml/2006/picture">
+                <pic:nvPicPr>
+                  <pic:cNvPr id="2" name="Figura2 Copia 1"/>
+                  <pic:cNvPicPr>
+                    <a:picLocks noChangeAspect="1" noChangeArrowheads="1"/>
+                  </pic:cNvPicPr>
+                </pic:nvPicPr>
+                <pic:blipFill>
+                  <a:blip r:embed="rId1"/>
+                  <a:stretch>
+                    <a:fillRect/>
+                  </a:stretch>
+                </pic:blipFill>
+                <pic:spPr bwMode="auto">
+                  <a:xfrm>
+                    <a:off x="0" y="0"/>
+                    <a:ext cx="539750" cy="641350"/>
+                  </a:xfrm>
+                  <a:prstGeom prst="rect">
+                    <a:avLst/>
+                  </a:prstGeom>
+                  <a:noFill/>
+                </pic:spPr>
+              </pic:pic>
+            </a:graphicData>
+          </a:graphic>
+        </wp:inline>
+      </w:drawing>
+    </w:r>
+  </w:p>
+  <w:p>
+    <w:pPr>
+      <w:pStyle w:val="BodyText"/>
+      <w:bidi w:val="0"/>
+      <w:spacing w:lineRule="auto" w:line="240" w:before="0" w:after="0"/>
+      <w:jc w:val="center"/>
+      <w:rPr>
+        <w:rFonts w:ascii="Times New Roman" w:hAnsi="Times New Roman"/>
+        <w:sz w:val="22"/>
+        <w:szCs w:val="22"/>
+      </w:rPr>
+    </w:pPr>
+    <w:r>
+      <w:rPr>
+        <w:rFonts w:ascii="Times New Roman" w:hAnsi="Times New Roman"/>
+        <w:sz w:val="22"/>
+        <w:szCs w:val="22"/>
+      </w:rPr>
+      <w:t>TABELIONATO DE PROTESTOS DO MUNICÍPIO E COMARCA DE IJUÍ/RS</w:t>
+    </w:r>
+  </w:p>
+</w:hdr>
+</file>
+
 <file path=word/styles.xml><?xml version="1.0" encoding="utf-8"?>
 <w:styles xmlns:w="http://schemas.openxmlformats.org/wordprocessingml/2006/main" xmlns:w14="http://schemas.microsoft.com/office/word/2010/wordml" xmlns:mc="http://schemas.openxmlformats.org/markup-compatibility/2006" mc:Ignorable="w14">
   <w:docDefaults>
@@ -763,7 +846,6 @@
     </w:rPrDefault>
     <w:pPrDefault>
       <w:pPr>
-        <w:widowControl/>
         <w:suppressAutoHyphens w:val="true"/>
       </w:pPr>
     </w:pPrDefault>
@@ -773,10 +855,11 @@
     <w:qFormat/>
     <w:pPr>
       <w:widowControl/>
-      <w:kinsoku w:val="true"/>
+      <w:suppressAutoHyphens w:val="true"/>
       <w:overflowPunct w:val="true"/>
-      <w:autoSpaceDE w:val="true"/>
       <w:bidi w:val="0"/>
+      <w:spacing w:before="0" w:after="0"/>
+      <w:jc w:val="left"/>
     </w:pPr>
     <w:rPr>
       <w:rFonts w:ascii="Liberation Serif" w:hAnsi="Liberation Serif" w:eastAsia="NSimSun" w:cs="Arial"/>
@@ -845,6 +928,30 @@
       <w:rFonts w:cs="Arial"/>
     </w:rPr>
   </w:style>
+  <w:style w:type="paragraph" w:styleId="Ttulouser">
+    <w:name w:val="Título (user)"/>
+    <w:basedOn w:val="Normal"/>
+    <w:next w:val="BodyText"/>
+    <w:pPr>
+      <w:keepNext w:val="true"/>
+      <w:spacing w:before="240" w:after="120"/>
+    </w:pPr>
+    <w:rPr>
+      <w:rFonts w:ascii="Liberation Sans" w:hAnsi="Liberation Sans" w:eastAsia="Microsoft YaHei" w:cs="Lucida Sans"/>
+      <w:sz w:val="28"/>
+      <w:szCs w:val="28"/>
+    </w:rPr>
+  </w:style>
+  <w:style w:type="paragraph" w:styleId="ndiceuser">
+    <w:name w:val="Índice (user)"/>
+    <w:basedOn w:val="Normal"/>
+    <w:pPr>
+      <w:suppressLineNumbers/>
+    </w:pPr>
+    <w:rPr>
+      <w:rFonts w:cs="Lucida Sans"/>
+    </w:rPr>
+  </w:style>
   <w:style w:type="paragraph" w:styleId="Cabealhoerodap">
     <w:name w:val="Cabeçalho e rodapé"/>
     <w:basedOn w:val="Normal"/>
@@ -857,6 +964,12 @@
         <w:tab w:val="right" w:pos="9638" w:leader="none"/>
       </w:tabs>
     </w:pPr>
+    <w:rPr/>
+  </w:style>
+  <w:style w:type="paragraph" w:styleId="Cabealhoerodapuser">
+    <w:name w:val="Cabeçalho e rodapé (user)"/>
+    <w:basedOn w:val="Normal"/>
+    <w:pPr/>
     <w:rPr/>
   </w:style>
   <w:style w:type="paragraph" w:styleId="Footer">

</xml_diff>